<commit_message>
feat: Add 2024 and 2025 accounting office document templates.
</commit_message>
<xml_diff>
--- a/backend/storage/templates/Ofic. Conta Plantilla DE 2024.docx
+++ b/backend/storage/templates/Ofic. Conta Plantilla DE 2024.docx
@@ -168,17 +168,45 @@
           <w:szCs w:val="24"/>
         </w:rPr>
       </w:pPr>
-      <w:proofErr w:type="gramStart"/>
-      <w:r>
-        <w:rPr>
-          <w:rFonts w:cs="Times New Roman"/>
-          <w:b/>
-          <w:sz w:val="24"/>
-          <w:szCs w:val="24"/>
-        </w:rPr>
-        <w:t>Lambayeque.-</w:t>
-      </w:r>
-      <w:proofErr w:type="gramEnd"/>
+      <w:r>
+        <w:rPr>
+          <w:rFonts w:cs="Times New Roman"/>
+          <w:b/>
+          <w:sz w:val="24"/>
+          <w:szCs w:val="24"/>
+        </w:rPr>
+        <w:t>Lambayeque</w:t>
+      </w:r>
+    </w:p>
+    <w:p>
+      <w:pPr>
+        <w:rPr>
+          <w:rFonts w:cs="Times New Roman"/>
+          <w:b/>
+          <w:sz w:val="24"/>
+          <w:szCs w:val="24"/>
+        </w:rPr>
+      </w:pPr>
+      <w:r>
+        <w:rPr>
+          <w:rFonts w:cs="Times New Roman"/>
+          <w:b/>
+          <w:sz w:val="24"/>
+          <w:szCs w:val="24"/>
+        </w:rPr>
+        <w:t>Presente</w:t>
+      </w:r>
+      <w:bookmarkStart w:id="0" w:name="_GoBack"/>
+      <w:bookmarkEnd w:id="0"/>
+      <w:r>
+        <w:rPr>
+          <w:rFonts w:cs="Times New Roman"/>
+          <w:b/>
+          <w:sz w:val="24"/>
+          <w:szCs w:val="24"/>
+        </w:rPr>
+        <w:t>.-</w:t>
+      </w:r>
     </w:p>
     <w:p>
       <w:pPr>
@@ -625,8 +653,6 @@
           <w:szCs w:val="24"/>
         </w:rPr>
       </w:pPr>
-      <w:bookmarkStart w:id="0" w:name="_GoBack"/>
-      <w:bookmarkEnd w:id="0"/>
     </w:p>
     <w:p>
       <w:pPr>

</xml_diff>